<commit_message>
Lawyer update: the virus scanner is live on Cloudflare Containers (14 Oct), Fly.io only a fallback; question 38 asks about the Cloudflare entry and the fallback.
Co-Authored-By: Claude Opus 5.5 <noreply@anthropic.com>
</commit_message>
<xml_diff>
--- a/docs/legal/FloorTest-Labs-update-2026-10-13.docx
+++ b/docs/legal/FloorTest-Labs-update-2026-10-13.docx
@@ -220,18 +220,6 @@
     </w:p>
     <w:p>
       <w:pPr>
-        <w:spacing w:after="160"/>
-      </w:pPr>
-      <w:r>
-        <w:rPr>
-          <w:b/>
-          <w:bCs/>
-        </w:rPr>
-        <w:t xml:space="preserve">Built, behind a switch or not yet on</w:t>
-      </w:r>
-    </w:p>
-    <w:p>
-      <w:pPr>
         <w:pStyle w:val="ListParagraph"/>
         <w:numPr>
           <w:ilvl w:val="0"/>
@@ -244,10 +232,22 @@
           <w:b/>
           <w:bCs/>
         </w:rPr>
-        <w:t xml:space="preserve">Account teams</w:t>
-      </w:r>
-      <w:r>
-        <w:t xml:space="preserve"> (built behind an on/off switch): a label or crew shares one desk with seats (Owner, A&amp;R / Admin, Member). The activity log names the teammate beside each action; teammates see the desk's log but never the holder's sign-ins, security, plan or alert settings (question 36).</w:t>
+        <w:t xml:space="preserve">Virus scanning</w:t>
+      </w:r>
+      <w:r>
+        <w:t xml:space="preserve"> of uploads, our own ClamAV service, on in production since 14 Oct. It reads every uploaded audio file, so its host is a sub-processor: Cloudflare Containers, and Cloudflare is already listed. Fly.io (London) is written down only as a fallback, for if Cloudflare can't keep up; using it would first make it a new sub-processor (question 38).</w:t>
+      </w:r>
+    </w:p>
+    <w:p>
+      <w:pPr>
+        <w:spacing w:after="160"/>
+      </w:pPr>
+      <w:r>
+        <w:rPr>
+          <w:b/>
+          <w:bCs/>
+        </w:rPr>
+        <w:t xml:space="preserve">Built, behind a switch or not yet on</w:t>
       </w:r>
     </w:p>
     <w:p>
@@ -264,10 +264,10 @@
           <w:b/>
           <w:bCs/>
         </w:rPr>
-        <w:t xml:space="preserve">Virus scanning</w:t>
-      </w:r>
-      <w:r>
-        <w:t xml:space="preserve"> of uploads, our own ClamAV service. It reads every uploaded audio file, so its host is a sub-processor. The owner chooses between Fly.io (London; a new sub-processor) and Cloudflare Containers (Cloudflare is already listed). Off until then (question 38).</w:t>
+        <w:t xml:space="preserve">Account teams</w:t>
+      </w:r>
+      <w:r>
+        <w:t xml:space="preserve"> (built behind an on/off switch): a label or crew shares one desk with seats (Owner, A&amp;R / Admin, Member). The activity log names the teammate beside each action; teammates see the desk's log but never the holder's sign-ins, security, plan or alert settings (question 36).</w:t>
       </w:r>
     </w:p>
     <w:p>
@@ -514,10 +514,10 @@
           <w:b/>
           <w:bCs/>
         </w:rPr>
-        <w:t xml:space="preserve">Scanner host:</w:t>
-      </w:r>
-      <w:r>
-        <w:t xml:space="preserve"> if the owner picks Fly.io, what has to happen first (Sub-processors page, notice period to users, data processing agreement)?</w:t>
+        <w:t xml:space="preserve">Scanner:</w:t>
+      </w:r>
+      <w:r>
+        <w:t xml:space="preserve"> it runs on Cloudflare, already a sub-processor. Should the Sub-processors and Privacy pages say Cloudflare also scans uploads for viruses? And if we ever move it to Fly.io, what has to happen first (Sub-processors page, notice period to users, data processing agreement)?</w:t>
       </w:r>
     </w:p>
     <w:p>

</xml_diff>